<commit_message>
#add a new project => intermediate project
</commit_message>
<xml_diff>
--- a/HABITTRACKER/Habit.docx
+++ b/HABITTRACKER/Habit.docx
@@ -18,7 +18,21 @@
         <w:rPr>
           <w:lang w:val="en-GB"/>
         </w:rPr>
-        <w:t xml:space="preserve">pplication C# with SQlite to </w:t>
+        <w:t xml:space="preserve">pplication C# with </w:t>
+      </w:r>
+      <w:proofErr w:type="spellStart"/>
+      <w:r>
+        <w:rPr>
+          <w:lang w:val="en-GB"/>
+        </w:rPr>
+        <w:t>SQlite</w:t>
+      </w:r>
+      <w:proofErr w:type="spellEnd"/>
+      <w:r>
+        <w:rPr>
+          <w:lang w:val="en-GB"/>
+        </w:rPr>
+        <w:t xml:space="preserve"> to </w:t>
       </w:r>
       <w:r>
         <w:rPr>
@@ -140,7 +154,21 @@
         <w:rPr>
           <w:lang w:val="en-GB"/>
         </w:rPr>
-        <w:t>The application uses SQlite like database to record habits.</w:t>
+        <w:t xml:space="preserve">The application uses </w:t>
+      </w:r>
+      <w:proofErr w:type="spellStart"/>
+      <w:r>
+        <w:rPr>
+          <w:lang w:val="en-GB"/>
+        </w:rPr>
+        <w:t>SQlite</w:t>
+      </w:r>
+      <w:proofErr w:type="spellEnd"/>
+      <w:r>
+        <w:rPr>
+          <w:lang w:val="en-GB"/>
+        </w:rPr>
+        <w:t xml:space="preserve"> like database to record habits.</w:t>
       </w:r>
     </w:p>
     <w:p>
@@ -172,11 +200,19 @@
         </w:rPr>
         <w:t xml:space="preserve"> </w:t>
       </w:r>
-      <w:r>
-        <w:rPr>
-          <w:lang w:val="en-GB"/>
-        </w:rPr>
-        <w:t>SQlite database (i</w:t>
+      <w:proofErr w:type="spellStart"/>
+      <w:r>
+        <w:rPr>
+          <w:lang w:val="en-GB"/>
+        </w:rPr>
+        <w:t>SQlite</w:t>
+      </w:r>
+      <w:proofErr w:type="spellEnd"/>
+      <w:r>
+        <w:rPr>
+          <w:lang w:val="en-GB"/>
+        </w:rPr>
+        <w:t xml:space="preserve"> database (i</w:t>
       </w:r>
       <w:r>
         <w:rPr>
@@ -718,6 +754,24 @@
           <w:lang w:val="en-GB"/>
         </w:rPr>
         <w:t>I've gotten better at using methods and classes, to keep my code tidier.</w:t>
+      </w:r>
+    </w:p>
+    <w:p>
+      <w:pPr>
+        <w:pStyle w:val="Paragrafoelenco"/>
+        <w:numPr>
+          <w:ilvl w:val="0"/>
+          <w:numId w:val="4"/>
+        </w:numPr>
+        <w:rPr>
+          <w:lang w:val="en-GB"/>
+        </w:rPr>
+      </w:pPr>
+      <w:r>
+        <w:rPr>
+          <w:lang w:val="en-GB"/>
+        </w:rPr>
+        <w:t>I’ve learned to write unit test. It is very important to check that methods worked as expected.</w:t>
       </w:r>
     </w:p>
     <w:sectPr>

</xml_diff>